<commit_message>
modified:   main.py 	new file:   scratch_gen_test.py 	new file:   scratch_inspect.py 	new file:   scratch_inspect_docx.py 	modified:   screens/certificate_screen.py 	new file:   screens/certificate_screen1.py 	modified:   temp_certificate.docx 	new file:   templets/semester - Temp - En - D.docx 	new file:   templets/semster - Temp - Copy.docx 	modified:   templets/semster - Temp.docx 	new file:   test_output.docx 	new file:   ~$mp_certificate.docx 	deleted:    ~$mp_certificate.docx
</commit_message>
<xml_diff>
--- a/templets/semster - Temp.docx
+++ b/templets/semster - Temp.docx
@@ -2,13 +2,12 @@
 <file path=word/document.xml><?xml version="1.0" encoding="utf-8"?>
 <w:document xmlns:wpc="http://schemas.microsoft.com/office/word/2010/wordprocessingCanvas" xmlns:cx="http://schemas.microsoft.com/office/drawing/2014/chartex" xmlns:cx1="http://schemas.microsoft.com/office/drawing/2015/9/8/chartex" xmlns:cx2="http://schemas.microsoft.com/office/drawing/2015/10/21/chartex" xmlns:cx3="http://schemas.microsoft.com/office/drawing/2016/5/9/chartex" xmlns:cx4="http://schemas.microsoft.com/office/drawing/2016/5/10/chartex" xmlns:cx5="http://schemas.microsoft.com/office/drawing/2016/5/11/chartex" xmlns:cx6="http://schemas.microsoft.com/office/drawing/2016/5/12/chartex" xmlns:cx7="http://schemas.microsoft.com/office/drawing/2016/5/13/chartex" xmlns:cx8="http://schemas.microsoft.com/office/drawing/2016/5/14/chartex" xmlns:mc="http://schemas.openxmlformats.org/markup-compatibility/2006" xmlns:aink="http://schemas.microsoft.com/office/drawing/2016/ink" xmlns:am3d="http://schemas.microsoft.com/office/drawing/2017/model3d" xmlns:o="urn:schemas-microsoft-com:office:office" xmlns:oel="http://schemas.microsoft.com/office/2019/extlst" xmlns:r="http://schemas.openxmlformats.org/officeDocument/2006/relationships" xmlns:m="http://schemas.openxmlformats.org/officeDocument/2006/math" xmlns:v="urn:schemas-microsoft-com:vml" xmlns:wp14="http://schemas.microsoft.com/office/word/2010/wordprocessingDrawing" xmlns:wp="http://schemas.openxmlformats.org/drawingml/2006/wordprocessingDrawing" xmlns:w10="urn:schemas-microsoft-com:office:word" xmlns:w="http://schemas.openxmlformats.org/wordprocessingml/2006/main" xmlns:w14="http://schemas.microsoft.com/office/word/2010/wordml" xmlns:w15="http://schemas.microsoft.com/office/word/2012/wordml" xmlns:w16cex="http://schemas.microsoft.com/office/word/2018/wordml/cex" xmlns:w16cid="http://schemas.microsoft.com/office/word/2016/wordml/cid" xmlns:w16="http://schemas.microsoft.com/office/word/2018/wordml" xmlns:w16du="http://schemas.microsoft.com/office/word/2023/wordml/word16du" xmlns:w16sdtdh="http://schemas.microsoft.com/office/word/2020/wordml/sdtdatahash" xmlns:w16sdtfl="http://schemas.microsoft.com/office/word/2024/wordml/sdtformatlock" xmlns:w16se="http://schemas.microsoft.com/office/word/2015/wordml/symex" xmlns:wpg="http://schemas.microsoft.com/office/word/2010/wordprocessingGroup" xmlns:wpi="http://schemas.microsoft.com/office/word/2010/wordprocessingInk" xmlns:wne="http://schemas.microsoft.com/office/word/2006/wordml" xmlns:wps="http://schemas.microsoft.com/office/word/2010/wordprocessingShape" mc:Ignorable="w14 w15 w16se w16cid w16 w16cex w16sdtdh w16sdtfl w16du wp14">
   <w:body>
-    <w:bookmarkStart w:id="0" w:name="a1"/>
-    <w:bookmarkEnd w:id="0"/>
     <w:p>
       <w:pPr>
         <w:tabs>
           <w:tab w:val="right" w:pos="9540"/>
         </w:tabs>
+        <w:bidi w:val="0"/>
         <w:rPr>
           <w:b/>
           <w:bCs/>
@@ -19,10 +18,12 @@
           <w:lang w:bidi="ar-IQ"/>
         </w:rPr>
       </w:pPr>
-      <w:r/>
+      <w:bookmarkStart w:id="0" w:name="a1"/>
+      <w:bookmarkEnd w:id="0"/>
     </w:p>
     <w:p>
       <w:pPr>
+        <w:bidi w:val="0"/>
         <w:rPr>
           <w:b/>
           <w:bCs/>
@@ -33,7 +34,6 @@
           <w:lang w:bidi="ar-IQ"/>
         </w:rPr>
       </w:pPr>
-      <w:r/>
     </w:p>
     <w:p>
       <w:pPr>
@@ -74,6 +74,7 @@
     </w:p>
     <w:p>
       <w:pPr>
+        <w:bidi w:val="0"/>
         <w:rPr>
           <w:b/>
           <w:bCs/>
@@ -102,10 +103,10 @@
         <w:tblLook w:val="04A0" w:firstRow="1" w:lastRow="0" w:firstColumn="1" w:lastColumn="0" w:noHBand="0" w:noVBand="1"/>
       </w:tblPr>
       <w:tblGrid>
-        <w:gridCol w:w="3542"/>
-        <w:gridCol w:w="3406"/>
-        <w:gridCol w:w="1915"/>
-        <w:gridCol w:w="1603"/>
+        <w:gridCol w:w="3516"/>
+        <w:gridCol w:w="3381"/>
+        <w:gridCol w:w="1993"/>
+        <w:gridCol w:w="1576"/>
       </w:tblGrid>
       <w:tr>
         <w:trPr>
@@ -113,28 +114,8 @@
         </w:trPr>
         <w:tc>
           <w:tcPr>
-            <w:tcW w:w="1692" w:type="pct"/>
-          </w:tcPr>
-          <w:p>
-            <w:pPr>
-              <w:bidi w:val="0"/>
-              <w:spacing w:line="240" w:lineRule="auto"/>
-              <w:rPr>
-                <w:rFonts w:cs="PT Bold Heading"/>
-                <w:sz w:val="20"/>
-                <w:szCs w:val="20"/>
-                <w:rtl/>
-                <w:lang w:bidi="ar-IQ"/>
-              </w:rPr>
-            </w:pPr>
-            <w:r>
-              <w:t>Full Name: {{student_name}}</w:t>
-            </w:r>
-          </w:p>
-        </w:tc>
-        <w:tc>
-          <w:tcPr>
-            <w:tcW w:w="1627" w:type="pct"/>
+            <w:tcW w:w="3295" w:type="pct"/>
+            <w:gridSpan w:val="2"/>
           </w:tcPr>
           <w:p>
             <w:pPr>
@@ -147,12 +128,14 @@
                 <w:lang w:bidi="ar-IQ"/>
               </w:rPr>
             </w:pPr>
-            <w:r/>
-          </w:p>
-        </w:tc>
-        <w:tc>
-          <w:tcPr>
-            <w:tcW w:w="915" w:type="pct"/>
+            <w:r>
+              <w:t>Full Name: {{student_name}}</w:t>
+            </w:r>
+          </w:p>
+        </w:tc>
+        <w:tc>
+          <w:tcPr>
+            <w:tcW w:w="952" w:type="pct"/>
           </w:tcPr>
           <w:p>
             <w:pPr>
@@ -165,12 +148,11 @@
                 <w:lang w:bidi="ar-IQ"/>
               </w:rPr>
             </w:pPr>
-            <w:r/>
-          </w:p>
-        </w:tc>
-        <w:tc>
-          <w:tcPr>
-            <w:tcW w:w="766" w:type="pct"/>
+          </w:p>
+        </w:tc>
+        <w:tc>
+          <w:tcPr>
+            <w:tcW w:w="753" w:type="pct"/>
           </w:tcPr>
           <w:p>
             <w:pPr>
@@ -183,7 +165,6 @@
                 <w:lang w:bidi="ar-IQ"/>
               </w:rPr>
             </w:pPr>
-            <w:r/>
           </w:p>
         </w:tc>
       </w:tr>
@@ -193,7 +174,8 @@
         </w:trPr>
         <w:tc>
           <w:tcPr>
-            <w:tcW w:w="1692" w:type="pct"/>
+            <w:tcW w:w="3295" w:type="pct"/>
+            <w:gridSpan w:val="2"/>
           </w:tcPr>
           <w:p>
             <w:pPr>
@@ -213,7 +195,8 @@
         </w:tc>
         <w:tc>
           <w:tcPr>
-            <w:tcW w:w="1627" w:type="pct"/>
+            <w:tcW w:w="1705" w:type="pct"/>
+            <w:gridSpan w:val="2"/>
           </w:tcPr>
           <w:p>
             <w:pPr>
@@ -231,42 +214,6 @@
             </w:r>
           </w:p>
         </w:tc>
-        <w:tc>
-          <w:tcPr>
-            <w:tcW w:w="915" w:type="pct"/>
-          </w:tcPr>
-          <w:p>
-            <w:pPr>
-              <w:bidi w:val="0"/>
-              <w:spacing w:line="240" w:lineRule="auto"/>
-              <w:rPr>
-                <w:rFonts w:cs="PT Bold Heading"/>
-                <w:sz w:val="20"/>
-                <w:szCs w:val="20"/>
-                <w:lang w:bidi="ar-IQ"/>
-              </w:rPr>
-            </w:pPr>
-            <w:r/>
-          </w:p>
-        </w:tc>
-        <w:tc>
-          <w:tcPr>
-            <w:tcW w:w="766" w:type="pct"/>
-          </w:tcPr>
-          <w:p>
-            <w:pPr>
-              <w:bidi w:val="0"/>
-              <w:spacing w:line="240" w:lineRule="auto"/>
-              <w:rPr>
-                <w:rFonts w:cs="PT Bold Heading"/>
-                <w:sz w:val="20"/>
-                <w:szCs w:val="20"/>
-                <w:lang w:bidi="ar-IQ"/>
-              </w:rPr>
-            </w:pPr>
-            <w:r/>
-          </w:p>
-        </w:tc>
       </w:tr>
       <w:tr>
         <w:trPr>
@@ -274,7 +221,7 @@
         </w:trPr>
         <w:tc>
           <w:tcPr>
-            <w:tcW w:w="1692" w:type="pct"/>
+            <w:tcW w:w="1680" w:type="pct"/>
           </w:tcPr>
           <w:p>
             <w:pPr>
@@ -296,7 +243,7 @@
         </w:tc>
         <w:tc>
           <w:tcPr>
-            <w:tcW w:w="1627" w:type="pct"/>
+            <w:tcW w:w="1615" w:type="pct"/>
           </w:tcPr>
           <w:p>
             <w:pPr>
@@ -318,7 +265,7 @@
         </w:tc>
         <w:tc>
           <w:tcPr>
-            <w:tcW w:w="915" w:type="pct"/>
+            <w:tcW w:w="952" w:type="pct"/>
           </w:tcPr>
           <w:p>
             <w:pPr>
@@ -331,12 +278,11 @@
                 <w:lang w:bidi="ar-IQ"/>
               </w:rPr>
             </w:pPr>
-            <w:r/>
-          </w:p>
-        </w:tc>
-        <w:tc>
-          <w:tcPr>
-            <w:tcW w:w="766" w:type="pct"/>
+          </w:p>
+        </w:tc>
+        <w:tc>
+          <w:tcPr>
+            <w:tcW w:w="753" w:type="pct"/>
           </w:tcPr>
           <w:p>
             <w:pPr>
@@ -349,7 +295,6 @@
                 <w:lang w:bidi="ar-IQ"/>
               </w:rPr>
             </w:pPr>
-            <w:r/>
           </w:p>
         </w:tc>
       </w:tr>
@@ -359,7 +304,7 @@
         </w:trPr>
         <w:tc>
           <w:tcPr>
-            <w:tcW w:w="3319" w:type="pct"/>
+            <w:tcW w:w="3295" w:type="pct"/>
             <w:gridSpan w:val="2"/>
           </w:tcPr>
           <w:p>
@@ -382,7 +327,7 @@
         </w:tc>
         <w:tc>
           <w:tcPr>
-            <w:tcW w:w="1681" w:type="pct"/>
+            <w:tcW w:w="1705" w:type="pct"/>
             <w:gridSpan w:val="2"/>
           </w:tcPr>
           <w:p>
@@ -408,7 +353,7 @@
         </w:trPr>
         <w:tc>
           <w:tcPr>
-            <w:tcW w:w="1692" w:type="pct"/>
+            <w:tcW w:w="1680" w:type="pct"/>
           </w:tcPr>
           <w:p>
             <w:pPr>
@@ -430,7 +375,7 @@
         </w:tc>
         <w:tc>
           <w:tcPr>
-            <w:tcW w:w="1627" w:type="pct"/>
+            <w:tcW w:w="1615" w:type="pct"/>
           </w:tcPr>
           <w:p>
             <w:pPr>
@@ -452,7 +397,7 @@
         </w:tc>
         <w:tc>
           <w:tcPr>
-            <w:tcW w:w="915" w:type="pct"/>
+            <w:tcW w:w="952" w:type="pct"/>
           </w:tcPr>
           <w:p>
             <w:pPr>
@@ -474,7 +419,7 @@
         </w:tc>
         <w:tc>
           <w:tcPr>
-            <w:tcW w:w="766" w:type="pct"/>
+            <w:tcW w:w="753" w:type="pct"/>
           </w:tcPr>
           <w:p>
             <w:pPr>
@@ -499,7 +444,7 @@
         </w:trPr>
         <w:tc>
           <w:tcPr>
-            <w:tcW w:w="1692" w:type="pct"/>
+            <w:tcW w:w="1680" w:type="pct"/>
           </w:tcPr>
           <w:p>
             <w:pPr>
@@ -519,7 +464,7 @@
         </w:tc>
         <w:tc>
           <w:tcPr>
-            <w:tcW w:w="1627" w:type="pct"/>
+            <w:tcW w:w="1615" w:type="pct"/>
           </w:tcPr>
           <w:p>
             <w:pPr>
@@ -539,7 +484,7 @@
         </w:tc>
         <w:tc>
           <w:tcPr>
-            <w:tcW w:w="1681" w:type="pct"/>
+            <w:tcW w:w="1705" w:type="pct"/>
             <w:gridSpan w:val="2"/>
           </w:tcPr>
           <w:p>
@@ -614,136 +559,187 @@
         <w:tblLook w:val="04A0" w:firstRow="1" w:lastRow="0" w:firstColumn="1" w:lastColumn="0" w:noHBand="0" w:noVBand="1"/>
       </w:tblPr>
       <w:tblGrid>
-        <w:gridCol w:w="5333"/>
-        <w:gridCol w:w="2438"/>
-        <w:gridCol w:w="2685"/>
+        <w:gridCol w:w="1564"/>
+        <w:gridCol w:w="1516"/>
+        <w:gridCol w:w="1414"/>
+        <w:gridCol w:w="1684"/>
+        <w:gridCol w:w="1635"/>
+        <w:gridCol w:w="1533"/>
+        <w:gridCol w:w="222"/>
+        <w:gridCol w:w="222"/>
+        <w:gridCol w:w="222"/>
+        <w:gridCol w:w="222"/>
+        <w:gridCol w:w="222"/>
       </w:tblGrid>
       <w:tr>
         <w:tc>
           <w:tcPr>
+            <w:tcW w:w="0" w:type="auto"/>
             <w:gridSpan w:val="6"/>
           </w:tcPr>
           <w:p>
+            <w:pPr>
+              <w:bidi w:val="0"/>
+            </w:pPr>
             <w:r>
-              <w:t xml:space="preserve">{%tr for sem in semesters %}</w:t>
+              <w:t>{%tr for sem in semesters %}</w:t>
             </w:r>
           </w:p>
         </w:tc>
         <w:tc>
           <w:tcPr>
+            <w:tcW w:w="0" w:type="auto"/>
             <w:vMerge/>
           </w:tcPr>
-          <w:p/>
-        </w:tc>
-        <w:tc>
-          <w:tcPr>
+          <w:p>
+            <w:pPr>
+              <w:bidi w:val="0"/>
+            </w:pPr>
+          </w:p>
+        </w:tc>
+        <w:tc>
+          <w:tcPr>
+            <w:tcW w:w="0" w:type="auto"/>
             <w:vMerge/>
           </w:tcPr>
-          <w:p/>
-        </w:tc>
-        <w:tc>
-          <w:tcPr>
+          <w:p>
+            <w:pPr>
+              <w:bidi w:val="0"/>
+            </w:pPr>
+          </w:p>
+        </w:tc>
+        <w:tc>
+          <w:tcPr>
+            <w:tcW w:w="0" w:type="auto"/>
             <w:vMerge/>
           </w:tcPr>
-          <w:p/>
-        </w:tc>
-        <w:tc>
-          <w:tcPr>
+          <w:p>
+            <w:pPr>
+              <w:bidi w:val="0"/>
+            </w:pPr>
+          </w:p>
+        </w:tc>
+        <w:tc>
+          <w:tcPr>
+            <w:tcW w:w="0" w:type="auto"/>
             <w:vMerge/>
           </w:tcPr>
-          <w:p/>
-        </w:tc>
-        <w:tc>
-          <w:tcPr>
+          <w:p>
+            <w:pPr>
+              <w:bidi w:val="0"/>
+            </w:pPr>
+          </w:p>
+        </w:tc>
+        <w:tc>
+          <w:tcPr>
+            <w:tcW w:w="0" w:type="auto"/>
             <w:vMerge/>
           </w:tcPr>
-          <w:p/>
+          <w:p>
+            <w:pPr>
+              <w:bidi w:val="0"/>
+            </w:pPr>
+          </w:p>
         </w:tc>
       </w:tr>
       <w:tr>
-        <w:tc>
-          <w:p>
+        <w:trPr>
+          <w:gridAfter w:val="5"/>
+        </w:trPr>
+        <w:tc>
+          <w:tcPr>
+            <w:tcW w:w="0" w:type="auto"/>
+            <w:gridSpan w:val="6"/>
+          </w:tcPr>
+          <w:p>
+            <w:pPr>
+              <w:bidi w:val="0"/>
+            </w:pPr>
             <w:r>
-              <w:t xml:space="preserve">{{ sem.label }}</w:t>
-            </w:r>
-          </w:p>
-        </w:tc>
-        <w:tc>
-          <w:p>
-            <w:r>
-              <w:t xml:space="preserve">{{ sem.label }}</w:t>
-            </w:r>
-          </w:p>
-        </w:tc>
-        <w:tc>
-          <w:p>
-            <w:r>
-              <w:t xml:space="preserve">{{ sem.label }}</w:t>
-            </w:r>
-          </w:p>
-        </w:tc>
-        <w:tc>
-          <w:p>
-            <w:r>
-              <w:t xml:space="preserve">{{ sem.label }}</w:t>
-            </w:r>
-          </w:p>
-        </w:tc>
-        <w:tc>
-          <w:p>
-            <w:r>
-              <w:t xml:space="preserve">{{ sem.label }}</w:t>
-            </w:r>
-          </w:p>
-        </w:tc>
-        <w:tc>
-          <w:p>
-            <w:r>
-              <w:t xml:space="preserve">{{ sem.label }}</w:t>
+              <w:t>{{ sem.label }}</w:t>
             </w:r>
           </w:p>
         </w:tc>
       </w:tr>
       <w:tr>
-        <w:tc>
-          <w:p>
+        <w:trPr>
+          <w:gridAfter w:val="5"/>
+        </w:trPr>
+        <w:tc>
+          <w:tcPr>
+            <w:tcW w:w="0" w:type="auto"/>
+          </w:tcPr>
+          <w:p>
+            <w:pPr>
+              <w:bidi w:val="0"/>
+            </w:pPr>
             <w:r>
-              <w:t xml:space="preserve">Subject</w:t>
+              <w:t>Subject</w:t>
             </w:r>
           </w:p>
         </w:tc>
         <w:tc>
-          <w:p>
+          <w:tcPr>
+            <w:tcW w:w="0" w:type="auto"/>
+          </w:tcPr>
+          <w:p>
+            <w:pPr>
+              <w:bidi w:val="0"/>
+            </w:pPr>
             <w:r>
-              <w:t xml:space="preserve">Mark</w:t>
+              <w:t>Mark</w:t>
             </w:r>
           </w:p>
         </w:tc>
         <w:tc>
-          <w:p>
+          <w:tcPr>
+            <w:tcW w:w="0" w:type="auto"/>
+          </w:tcPr>
+          <w:p>
+            <w:pPr>
+              <w:bidi w:val="0"/>
+            </w:pPr>
             <w:r>
-              <w:t xml:space="preserve">Unit</w:t>
+              <w:t>Unit</w:t>
             </w:r>
           </w:p>
         </w:tc>
         <w:tc>
-          <w:p>
+          <w:tcPr>
+            <w:tcW w:w="0" w:type="auto"/>
+          </w:tcPr>
+          <w:p>
+            <w:pPr>
+              <w:bidi w:val="0"/>
+            </w:pPr>
             <w:r>
-              <w:t xml:space="preserve">Subject</w:t>
+              <w:t>Subject</w:t>
             </w:r>
           </w:p>
         </w:tc>
         <w:tc>
-          <w:p>
+          <w:tcPr>
+            <w:tcW w:w="0" w:type="auto"/>
+          </w:tcPr>
+          <w:p>
+            <w:pPr>
+              <w:bidi w:val="0"/>
+            </w:pPr>
             <w:r>
-              <w:t xml:space="preserve">Mark</w:t>
+              <w:t>Mark</w:t>
             </w:r>
           </w:p>
         </w:tc>
         <w:tc>
-          <w:p>
+          <w:tcPr>
+            <w:tcW w:w="0" w:type="auto"/>
+          </w:tcPr>
+          <w:p>
+            <w:pPr>
+              <w:bidi w:val="0"/>
+            </w:pPr>
             <w:r>
-              <w:t xml:space="preserve">Unit</w:t>
+              <w:t>Unit</w:t>
             </w:r>
           </w:p>
         </w:tc>
@@ -751,85 +747,153 @@
       <w:tr>
         <w:tc>
           <w:tcPr>
+            <w:tcW w:w="0" w:type="auto"/>
             <w:gridSpan w:val="6"/>
           </w:tcPr>
           <w:p>
+            <w:pPr>
+              <w:bidi w:val="0"/>
+            </w:pPr>
             <w:r>
-              <w:t xml:space="preserve">{%tr for row in sem.rows %}</w:t>
+              <w:t>{%tr for row in sem.rows %}</w:t>
             </w:r>
           </w:p>
         </w:tc>
         <w:tc>
           <w:tcPr>
+            <w:tcW w:w="0" w:type="auto"/>
             <w:vMerge/>
           </w:tcPr>
-          <w:p/>
-        </w:tc>
-        <w:tc>
-          <w:tcPr>
+          <w:p>
+            <w:pPr>
+              <w:bidi w:val="0"/>
+            </w:pPr>
+          </w:p>
+        </w:tc>
+        <w:tc>
+          <w:tcPr>
+            <w:tcW w:w="0" w:type="auto"/>
             <w:vMerge/>
           </w:tcPr>
-          <w:p/>
-        </w:tc>
-        <w:tc>
-          <w:tcPr>
+          <w:p>
+            <w:pPr>
+              <w:bidi w:val="0"/>
+            </w:pPr>
+          </w:p>
+        </w:tc>
+        <w:tc>
+          <w:tcPr>
+            <w:tcW w:w="0" w:type="auto"/>
             <w:vMerge/>
           </w:tcPr>
-          <w:p/>
-        </w:tc>
-        <w:tc>
-          <w:tcPr>
+          <w:p>
+            <w:pPr>
+              <w:bidi w:val="0"/>
+            </w:pPr>
+          </w:p>
+        </w:tc>
+        <w:tc>
+          <w:tcPr>
+            <w:tcW w:w="0" w:type="auto"/>
             <w:vMerge/>
           </w:tcPr>
-          <w:p/>
-        </w:tc>
-        <w:tc>
-          <w:tcPr>
+          <w:p>
+            <w:pPr>
+              <w:bidi w:val="0"/>
+            </w:pPr>
+          </w:p>
+        </w:tc>
+        <w:tc>
+          <w:tcPr>
+            <w:tcW w:w="0" w:type="auto"/>
             <w:vMerge/>
           </w:tcPr>
-          <w:p/>
+          <w:p>
+            <w:pPr>
+              <w:bidi w:val="0"/>
+            </w:pPr>
+          </w:p>
         </w:tc>
       </w:tr>
       <w:tr>
-        <w:tc>
-          <w:p>
+        <w:trPr>
+          <w:gridAfter w:val="5"/>
+        </w:trPr>
+        <w:tc>
+          <w:tcPr>
+            <w:tcW w:w="0" w:type="auto"/>
+          </w:tcPr>
+          <w:p>
+            <w:pPr>
+              <w:bidi w:val="0"/>
+            </w:pPr>
             <w:r>
-              <w:t xml:space="preserve">{{ row.left_name }}</w:t>
+              <w:t>{{ row.left_name }}</w:t>
             </w:r>
           </w:p>
         </w:tc>
         <w:tc>
-          <w:p>
+          <w:tcPr>
+            <w:tcW w:w="0" w:type="auto"/>
+          </w:tcPr>
+          <w:p>
+            <w:pPr>
+              <w:bidi w:val="0"/>
+            </w:pPr>
             <w:r>
-              <w:t xml:space="preserve">{{ row.left_mark }}</w:t>
+              <w:t>{{ row.left_mark }}</w:t>
             </w:r>
           </w:p>
         </w:tc>
         <w:tc>
-          <w:p>
+          <w:tcPr>
+            <w:tcW w:w="0" w:type="auto"/>
+          </w:tcPr>
+          <w:p>
+            <w:pPr>
+              <w:bidi w:val="0"/>
+            </w:pPr>
             <w:r>
-              <w:t xml:space="preserve">{{ row.left_unit }}</w:t>
+              <w:t>{{ row.left_unit }}</w:t>
             </w:r>
           </w:p>
         </w:tc>
         <w:tc>
-          <w:p>
+          <w:tcPr>
+            <w:tcW w:w="0" w:type="auto"/>
+          </w:tcPr>
+          <w:p>
+            <w:pPr>
+              <w:bidi w:val="0"/>
+            </w:pPr>
             <w:r>
-              <w:t xml:space="preserve">{{ row.right_name }}</w:t>
+              <w:t>{{ row.right_name }}</w:t>
             </w:r>
           </w:p>
         </w:tc>
         <w:tc>
-          <w:p>
+          <w:tcPr>
+            <w:tcW w:w="0" w:type="auto"/>
+          </w:tcPr>
+          <w:p>
+            <w:pPr>
+              <w:bidi w:val="0"/>
+            </w:pPr>
             <w:r>
-              <w:t xml:space="preserve">{{ row.right_mark }}</w:t>
+              <w:t>{{ row.right_mark }}</w:t>
             </w:r>
           </w:p>
         </w:tc>
         <w:tc>
-          <w:p>
+          <w:tcPr>
+            <w:tcW w:w="0" w:type="auto"/>
+          </w:tcPr>
+          <w:p>
+            <w:pPr>
+              <w:bidi w:val="0"/>
+            </w:pPr>
             <w:r>
-              <w:t xml:space="preserve">{{ row.right_unit }}</w:t>
+              <w:t>{{ row.right_unit }}</w:t>
             </w:r>
           </w:p>
         </w:tc>
@@ -837,88 +901,162 @@
       <w:tr>
         <w:tc>
           <w:tcPr>
+            <w:tcW w:w="0" w:type="auto"/>
             <w:gridSpan w:val="6"/>
           </w:tcPr>
           <w:p>
+            <w:pPr>
+              <w:bidi w:val="0"/>
+            </w:pPr>
             <w:r>
-              <w:t xml:space="preserve">{%tr endfor %}</w:t>
+              <w:t>{%tr endfor %}</w:t>
             </w:r>
           </w:p>
         </w:tc>
         <w:tc>
           <w:tcPr>
+            <w:tcW w:w="0" w:type="auto"/>
             <w:vMerge/>
           </w:tcPr>
-          <w:p/>
-        </w:tc>
-        <w:tc>
-          <w:tcPr>
+          <w:p>
+            <w:pPr>
+              <w:bidi w:val="0"/>
+            </w:pPr>
+          </w:p>
+        </w:tc>
+        <w:tc>
+          <w:tcPr>
+            <w:tcW w:w="0" w:type="auto"/>
             <w:vMerge/>
           </w:tcPr>
-          <w:p/>
-        </w:tc>
-        <w:tc>
-          <w:tcPr>
+          <w:p>
+            <w:pPr>
+              <w:bidi w:val="0"/>
+            </w:pPr>
+          </w:p>
+        </w:tc>
+        <w:tc>
+          <w:tcPr>
+            <w:tcW w:w="0" w:type="auto"/>
             <w:vMerge/>
           </w:tcPr>
-          <w:p/>
-        </w:tc>
-        <w:tc>
-          <w:tcPr>
+          <w:p>
+            <w:pPr>
+              <w:bidi w:val="0"/>
+            </w:pPr>
+          </w:p>
+        </w:tc>
+        <w:tc>
+          <w:tcPr>
+            <w:tcW w:w="0" w:type="auto"/>
             <w:vMerge/>
           </w:tcPr>
-          <w:p/>
-        </w:tc>
-        <w:tc>
-          <w:tcPr>
+          <w:p>
+            <w:pPr>
+              <w:bidi w:val="0"/>
+            </w:pPr>
+          </w:p>
+        </w:tc>
+        <w:tc>
+          <w:tcPr>
+            <w:tcW w:w="0" w:type="auto"/>
             <w:vMerge/>
           </w:tcPr>
-          <w:p/>
+          <w:p>
+            <w:pPr>
+              <w:bidi w:val="0"/>
+            </w:pPr>
+          </w:p>
         </w:tc>
       </w:tr>
       <w:tr>
         <w:tc>
           <w:tcPr>
+            <w:tcW w:w="0" w:type="auto"/>
             <w:gridSpan w:val="6"/>
           </w:tcPr>
           <w:p>
+            <w:pPr>
+              <w:bidi w:val="0"/>
+            </w:pPr>
             <w:r>
-              <w:t xml:space="preserve">{%tr endfor %}</w:t>
+              <w:lastRenderedPageBreak/>
+              <w:t>{%tr endfor %}</w:t>
             </w:r>
           </w:p>
         </w:tc>
         <w:tc>
           <w:tcPr>
+            <w:tcW w:w="0" w:type="auto"/>
             <w:vMerge/>
           </w:tcPr>
-          <w:p/>
-        </w:tc>
-        <w:tc>
-          <w:tcPr>
+          <w:p>
+            <w:pPr>
+              <w:bidi w:val="0"/>
+            </w:pPr>
+          </w:p>
+        </w:tc>
+        <w:tc>
+          <w:tcPr>
+            <w:tcW w:w="0" w:type="auto"/>
             <w:vMerge/>
           </w:tcPr>
-          <w:p/>
-        </w:tc>
-        <w:tc>
-          <w:tcPr>
+          <w:p>
+            <w:pPr>
+              <w:bidi w:val="0"/>
+            </w:pPr>
+          </w:p>
+        </w:tc>
+        <w:tc>
+          <w:tcPr>
+            <w:tcW w:w="0" w:type="auto"/>
             <w:vMerge/>
           </w:tcPr>
-          <w:p/>
-        </w:tc>
-        <w:tc>
-          <w:tcPr>
+          <w:p>
+            <w:pPr>
+              <w:bidi w:val="0"/>
+            </w:pPr>
+          </w:p>
+        </w:tc>
+        <w:tc>
+          <w:tcPr>
+            <w:tcW w:w="0" w:type="auto"/>
             <w:vMerge/>
           </w:tcPr>
-          <w:p/>
-        </w:tc>
-        <w:tc>
-          <w:tcPr>
+          <w:p>
+            <w:pPr>
+              <w:bidi w:val="0"/>
+            </w:pPr>
+          </w:p>
+        </w:tc>
+        <w:tc>
+          <w:tcPr>
+            <w:tcW w:w="0" w:type="auto"/>
             <w:vMerge/>
           </w:tcPr>
-          <w:p/>
+          <w:p>
+            <w:pPr>
+              <w:bidi w:val="0"/>
+            </w:pPr>
+          </w:p>
         </w:tc>
       </w:tr>
     </w:tbl>
+    <w:p>
+      <w:pPr>
+        <w:bidi w:val="0"/>
+        <w:spacing w:line="240" w:lineRule="auto"/>
+      </w:pPr>
+    </w:p>
+    <w:p>
+      <w:pPr>
+        <w:bidi w:val="0"/>
+        <w:spacing w:line="240" w:lineRule="auto"/>
+      </w:pPr>
+      <w:r>
+        <w:t>{% endfor %}</w:t>
+      </w:r>
+    </w:p>
     <w:p>
       <w:pPr>
         <w:bidi w:val="0"/>
@@ -930,9 +1068,6 @@
           <w:lang w:bidi="ar-IQ"/>
         </w:rPr>
       </w:pPr>
-      <w:r>
-        <w:t>{% endfor %}</w:t>
-      </w:r>
     </w:p>
     <w:p>
       <w:pPr>
@@ -946,7 +1081,6 @@
           <w:lang w:bidi="ar-IQ"/>
         </w:rPr>
       </w:pPr>
-      <w:r/>
     </w:p>
     <w:p>
       <w:pPr>
@@ -959,7 +1093,6 @@
           <w:lang w:bidi="ar-IQ"/>
         </w:rPr>
       </w:pPr>
-      <w:r/>
     </w:p>
     <w:p>
       <w:pPr>
@@ -972,7 +1105,6 @@
           <w:lang w:bidi="ar-IQ"/>
         </w:rPr>
       </w:pPr>
-      <w:r/>
     </w:p>
     <w:p>
       <w:pPr>
@@ -985,7 +1117,6 @@
           <w:lang w:bidi="ar-IQ"/>
         </w:rPr>
       </w:pPr>
-      <w:r/>
     </w:p>
     <w:p>
       <w:pPr>
@@ -1000,10 +1131,10 @@
           <w:lang w:bidi="ar-IQ"/>
         </w:rPr>
       </w:pPr>
-      <w:r/>
     </w:p>
     <w:p>
       <w:pPr>
+        <w:bidi w:val="0"/>
         <w:rPr>
           <w:sz w:val="24"/>
           <w:szCs w:val="24"/>
@@ -1011,14 +1142,13 @@
           <w:lang w:bidi="ar-IQ"/>
         </w:rPr>
       </w:pPr>
-      <w:r/>
     </w:p>
     <w:tbl>
       <w:tblPr>
         <w:tblStyle w:val="TableGrid"/>
         <w:bidiVisual/>
         <w:tblW w:w="9900" w:type="dxa"/>
-        <w:tblInd w:w="227" w:type="dxa"/>
+        <w:jc w:val="right"/>
         <w:tblBorders>
           <w:top w:val="none" w:sz="0" w:space="0" w:color="auto"/>
           <w:left w:val="none" w:sz="0" w:space="0" w:color="auto"/>
@@ -1037,6 +1167,7 @@
       <w:tr>
         <w:trPr>
           <w:trHeight w:val="294"/>
+          <w:jc w:val="right"/>
         </w:trPr>
         <w:tc>
           <w:tcPr>
@@ -1044,13 +1175,21 @@
             <w:vAlign w:val="center"/>
           </w:tcPr>
           <w:p>
+            <w:pPr>
+              <w:bidi w:val="0"/>
+              <w:jc w:val="center"/>
+            </w:pPr>
             <w:r>
-              <w:t xml:space="preserve">{{sig3_title}} {{sig3_name}}</w:t>
+              <w:t>{{sig3_title}} {{sig3_name}}</w:t>
             </w:r>
           </w:p>
           <w:p>
+            <w:pPr>
+              <w:bidi w:val="0"/>
+              <w:jc w:val="center"/>
+            </w:pPr>
             <w:r>
-              <w:t xml:space="preserve">{{sig3_resp}}</w:t>
+              <w:t>{{sig3_resp}}</w:t>
             </w:r>
           </w:p>
         </w:tc>
@@ -1061,6 +1200,7 @@
           </w:tcPr>
           <w:p>
             <w:pPr>
+              <w:bidi w:val="0"/>
               <w:spacing w:after="0" w:line="240" w:lineRule="auto"/>
               <w:jc w:val="center"/>
               <w:rPr>
@@ -1070,7 +1210,6 @@
                 <w:lang w:bidi="ar-IQ"/>
               </w:rPr>
             </w:pPr>
-            <w:r/>
           </w:p>
         </w:tc>
         <w:tc>
@@ -1079,13 +1218,21 @@
             <w:vAlign w:val="center"/>
           </w:tcPr>
           <w:p>
+            <w:pPr>
+              <w:bidi w:val="0"/>
+              <w:jc w:val="center"/>
+            </w:pPr>
             <w:r>
-              <w:t xml:space="preserve">{{sig1_title}} {{sig1_name}}</w:t>
+              <w:t>{{sig1_title}} {{sig1_name}}</w:t>
             </w:r>
           </w:p>
           <w:p>
+            <w:pPr>
+              <w:bidi w:val="0"/>
+              <w:jc w:val="center"/>
+            </w:pPr>
             <w:r>
-              <w:t xml:space="preserve">{{sig1_resp}}</w:t>
+              <w:t>{{sig1_resp}}</w:t>
             </w:r>
           </w:p>
         </w:tc>
@@ -1093,6 +1240,7 @@
       <w:tr>
         <w:trPr>
           <w:trHeight w:val="1457"/>
+          <w:jc w:val="right"/>
         </w:trPr>
         <w:tc>
           <w:tcPr>
@@ -1100,13 +1248,21 @@
             <w:vAlign w:val="center"/>
           </w:tcPr>
           <w:p>
+            <w:pPr>
+              <w:bidi w:val="0"/>
+              <w:jc w:val="center"/>
+            </w:pPr>
             <w:r>
-              <w:t xml:space="preserve">{{sig4_title}} {{sig4_name}}</w:t>
+              <w:t>{{sig4_title}} {{sig4_name}}</w:t>
             </w:r>
           </w:p>
           <w:p>
+            <w:pPr>
+              <w:bidi w:val="0"/>
+              <w:jc w:val="center"/>
+            </w:pPr>
             <w:r>
-              <w:t xml:space="preserve">{{sig4_resp}}</w:t>
+              <w:t>{{sig4_resp}}</w:t>
             </w:r>
           </w:p>
         </w:tc>
@@ -1117,6 +1273,7 @@
           </w:tcPr>
           <w:p>
             <w:pPr>
+              <w:bidi w:val="0"/>
               <w:spacing w:after="0" w:line="240" w:lineRule="auto"/>
               <w:jc w:val="center"/>
               <w:rPr>
@@ -1126,10 +1283,10 @@
                 <w:lang w:bidi="ar-IQ"/>
               </w:rPr>
             </w:pPr>
-            <w:r/>
-          </w:p>
-          <w:p>
-            <w:pPr>
+          </w:p>
+          <w:p>
+            <w:pPr>
+              <w:bidi w:val="0"/>
               <w:spacing w:after="0" w:line="240" w:lineRule="auto"/>
               <w:jc w:val="center"/>
               <w:rPr>
@@ -1139,10 +1296,10 @@
                 <w:lang w:bidi="ar-IQ"/>
               </w:rPr>
             </w:pPr>
-            <w:r/>
-          </w:p>
-          <w:p>
-            <w:pPr>
+          </w:p>
+          <w:p>
+            <w:pPr>
+              <w:bidi w:val="0"/>
               <w:spacing w:after="0" w:line="240" w:lineRule="auto"/>
               <w:jc w:val="center"/>
               <w:rPr>
@@ -1152,7 +1309,6 @@
                 <w:lang w:bidi="ar-IQ"/>
               </w:rPr>
             </w:pPr>
-            <w:r/>
           </w:p>
         </w:tc>
         <w:tc>
@@ -1161,13 +1317,21 @@
             <w:vAlign w:val="center"/>
           </w:tcPr>
           <w:p>
+            <w:pPr>
+              <w:bidi w:val="0"/>
+              <w:jc w:val="center"/>
+            </w:pPr>
             <w:r>
-              <w:t xml:space="preserve">{{sig2_title}} {{sig2_name}}</w:t>
+              <w:t>{{sig2_title}} {{sig2_name}}</w:t>
             </w:r>
           </w:p>
           <w:p>
+            <w:pPr>
+              <w:bidi w:val="0"/>
+              <w:jc w:val="center"/>
+            </w:pPr>
             <w:r>
-              <w:t xml:space="preserve">{{sig2_resp}}</w:t>
+              <w:t>{{sig2_resp}}</w:t>
             </w:r>
           </w:p>
         </w:tc>
@@ -1175,18 +1339,17 @@
     </w:tbl>
     <w:p>
       <w:pPr>
-        <w:jc w:val="center"/>
+        <w:bidi w:val="0"/>
         <w:rPr>
           <w:sz w:val="24"/>
           <w:szCs w:val="24"/>
           <w:lang w:bidi="ar-IQ"/>
         </w:rPr>
       </w:pPr>
-      <w:r/>
     </w:p>
     <w:p>
       <w:pPr>
-        <w:jc w:val="center"/>
+        <w:bidi w:val="0"/>
         <w:rPr>
           <w:sz w:val="24"/>
           <w:szCs w:val="24"/>
@@ -1194,10 +1357,10 @@
           <w:lang w:bidi="ar-IQ"/>
         </w:rPr>
       </w:pPr>
-      <w:r/>
     </w:p>
     <w:p>
       <w:pPr>
+        <w:bidi w:val="0"/>
         <w:rPr>
           <w:sz w:val="24"/>
           <w:szCs w:val="24"/>
@@ -1218,10 +1381,10 @@
           <w:lang w:bidi="ar-IQ"/>
         </w:rPr>
       </w:pPr>
-      <w:r/>
     </w:p>
     <w:p>
       <w:pPr>
+        <w:bidi w:val="0"/>
         <w:rPr>
           <w:sz w:val="24"/>
           <w:szCs w:val="24"/>
@@ -1229,10 +1392,10 @@
           <w:lang w:bidi="ar-IQ"/>
         </w:rPr>
       </w:pPr>
-      <w:r/>
     </w:p>
     <w:p>
       <w:pPr>
+        <w:bidi w:val="0"/>
         <w:rPr>
           <w:sz w:val="24"/>
           <w:szCs w:val="24"/>
@@ -1240,10 +1403,10 @@
           <w:lang w:bidi="ar-IQ"/>
         </w:rPr>
       </w:pPr>
-      <w:r/>
     </w:p>
     <w:p>
       <w:pPr>
+        <w:bidi w:val="0"/>
         <w:rPr>
           <w:sz w:val="24"/>
           <w:szCs w:val="24"/>
@@ -1251,10 +1414,10 @@
           <w:lang w:bidi="ar-IQ"/>
         </w:rPr>
       </w:pPr>
-      <w:r/>
     </w:p>
     <w:p>
       <w:pPr>
+        <w:bidi w:val="0"/>
         <w:rPr>
           <w:sz w:val="24"/>
           <w:szCs w:val="24"/>
@@ -1262,7 +1425,15 @@
           <w:lang w:bidi="ar-IQ"/>
         </w:rPr>
       </w:pPr>
-      <w:r/>
+    </w:p>
+    <w:p>
+      <w:pPr>
+        <w:bidi w:val="0"/>
+        <w:spacing w:after="0" w:line="240" w:lineRule="auto"/>
+      </w:pPr>
+      <w:r>
+        <w:br w:type="page"/>
+      </w:r>
     </w:p>
     <w:p>
       <w:pPr>
@@ -1275,12 +1446,13 @@
         </w:rPr>
       </w:pPr>
       <w:r>
+        <w:lastRenderedPageBreak/>
         <w:t>{{Back_page}}</w:t>
       </w:r>
     </w:p>
     <w:p>
       <w:pPr>
-        <w:jc w:val="center"/>
+        <w:bidi w:val="0"/>
         <w:rPr>
           <w:sz w:val="24"/>
           <w:szCs w:val="24"/>
@@ -1288,7 +1460,6 @@
           <w:lang w:bidi="ar-IQ"/>
         </w:rPr>
       </w:pPr>
-      <w:r/>
     </w:p>
     <w:tbl>
       <w:tblPr>
@@ -1320,13 +1491,30 @@
             <w:vAlign w:val="center"/>
           </w:tcPr>
           <w:p>
+            <w:pPr>
+              <w:bidi w:val="0"/>
+              <w:jc w:val="center"/>
+            </w:pPr>
             <w:r>
-              <w:t xml:space="preserve">{{sig6_name}}</w:t>
+              <w:t>{{sig</w:t>
             </w:r>
-          </w:p>
-          <w:p>
             <w:r>
-              <w:t xml:space="preserve">{{sig6_resp}}</w:t>
+              <w:t>6</w:t>
+            </w:r>
+            <w:r>
+              <w:t xml:space="preserve">_title}} </w:t>
+            </w:r>
+            <w:r>
+              <w:t>{{sig6_name}}</w:t>
+            </w:r>
+          </w:p>
+          <w:p>
+            <w:pPr>
+              <w:bidi w:val="0"/>
+              <w:jc w:val="center"/>
+            </w:pPr>
+            <w:r>
+              <w:t>{{sig6_resp}}</w:t>
             </w:r>
           </w:p>
         </w:tc>
@@ -1336,13 +1524,30 @@
             <w:vAlign w:val="center"/>
           </w:tcPr>
           <w:p>
+            <w:pPr>
+              <w:bidi w:val="0"/>
+              <w:jc w:val="center"/>
+            </w:pPr>
             <w:r>
-              <w:t xml:space="preserve">{{sig5_name}}</w:t>
+              <w:t>{{sig</w:t>
             </w:r>
-          </w:p>
-          <w:p>
             <w:r>
-              <w:t xml:space="preserve">{{sig5_resp}}</w:t>
+              <w:t>5</w:t>
+            </w:r>
+            <w:r>
+              <w:t xml:space="preserve">_title}} </w:t>
+            </w:r>
+            <w:r>
+              <w:t>{{sig5_name}}</w:t>
+            </w:r>
+          </w:p>
+          <w:p>
+            <w:pPr>
+              <w:bidi w:val="0"/>
+              <w:jc w:val="center"/>
+            </w:pPr>
+            <w:r>
+              <w:t>{{sig5_resp}}</w:t>
             </w:r>
           </w:p>
         </w:tc>
@@ -1350,13 +1555,13 @@
     </w:tbl>
     <w:p>
       <w:pPr>
+        <w:bidi w:val="0"/>
         <w:rPr>
           <w:sz w:val="24"/>
           <w:szCs w:val="24"/>
           <w:lang w:bidi="ar-IQ"/>
         </w:rPr>
       </w:pPr>
-      <w:r/>
     </w:p>
     <w:p>
       <w:pPr>
@@ -1411,9 +1616,15 @@
       </w:pPr>
       <w:r>
         <w:t>Grades:</w:t>
+      </w:r>
+      <w:r>
         <w:tab/>
         <w:t>Fair</w:t>
+      </w:r>
+      <w:r>
         <w:tab/>
+      </w:r>
+      <w:r>
         <w:tab/>
         <w:t>(50 - less than 60)</w:t>
       </w:r>
@@ -1431,6 +1642,8 @@
       </w:pPr>
       <w:r>
         <w:t>Medium</w:t>
+      </w:r>
+      <w:r>
         <w:tab/>
         <w:t>(60- less than 70)</w:t>
       </w:r>
@@ -1448,7 +1661,11 @@
       </w:pPr>
       <w:r>
         <w:t>Good</w:t>
+      </w:r>
+      <w:r>
         <w:tab/>
+      </w:r>
+      <w:r>
         <w:tab/>
         <w:t>(70- less than 80)</w:t>
       </w:r>
@@ -1466,6 +1683,8 @@
       </w:pPr>
       <w:r>
         <w:t>Very good</w:t>
+      </w:r>
+      <w:r>
         <w:tab/>
         <w:t>(80- less than 90)</w:t>
       </w:r>
@@ -1483,8 +1702,12 @@
       </w:pPr>
       <w:r>
         <w:t>Excellent</w:t>
+      </w:r>
+      <w:r>
         <w:tab/>
         <w:t>(90-100)</w:t>
+      </w:r>
+      <w:r>
         <w:tab/>
       </w:r>
     </w:p>
@@ -1499,7 +1722,6 @@
           <w:lang w:bidi="ar-IQ"/>
         </w:rPr>
       </w:pPr>
-      <w:r/>
     </w:p>
     <w:p>
       <w:pPr>
@@ -1578,6 +1800,7 @@
     </w:p>
     <w:p>
       <w:pPr>
+        <w:bidi w:val="0"/>
         <w:spacing w:after="0" w:line="240" w:lineRule="auto"/>
         <w:rPr>
           <w:rFonts w:ascii="Arial" w:hAnsi="Arial"/>
@@ -1586,7 +1809,6 @@
           <w:lang w:bidi="ar-IQ"/>
         </w:rPr>
       </w:pPr>
-      <w:r/>
     </w:p>
     <w:sectPr>
       <w:headerReference w:type="even" r:id="rId8"/>
@@ -1639,7 +1861,6 @@
         <w:lang w:bidi="ar-IQ"/>
       </w:rPr>
     </w:pPr>
-    <w:r/>
   </w:p>
 </w:ftr>
 </file>
@@ -1679,7 +1900,7 @@
       <w:rPr>
         <w:noProof/>
       </w:rPr>
-      <w:pict w14:anchorId="3A5186EC">
+      <w:pict w14:anchorId="40E608AF">
         <v:shapetype id="_x0000_t75" coordsize="21600,21600" o:spt="75" o:preferrelative="t" path="m@4@5l@4@11@9@11@9@5xe" filled="f" stroked="f">
           <v:stroke joinstyle="miter"/>
           <v:formulas>
@@ -1720,7 +1941,6 @@
         <w:lang w:bidi="ar-IQ"/>
       </w:rPr>
     </w:pPr>
-    <w:r/>
   </w:p>
   <w:p>
     <w:pPr>
@@ -1731,7 +1951,6 @@
         <w:lang w:bidi="ar-IQ"/>
       </w:rPr>
     </w:pPr>
-    <w:r/>
   </w:p>
   <w:p>
     <w:pPr>
@@ -1744,7 +1963,6 @@
         <w:lang w:bidi="ar-IQ"/>
       </w:rPr>
     </w:pPr>
-    <w:r/>
   </w:p>
   <w:p>
     <w:pPr>
@@ -1754,7 +1972,6 @@
         <w:lang w:bidi="ar-IQ"/>
       </w:rPr>
     </w:pPr>
-    <w:r/>
   </w:p>
   <w:p>
     <w:pPr>
@@ -1763,13 +1980,11 @@
         <w:lang w:bidi="ar-IQ"/>
       </w:rPr>
     </w:pPr>
-    <w:r/>
   </w:p>
   <w:p>
     <w:pPr>
       <w:pStyle w:val="Header"/>
     </w:pPr>
-    <w:r/>
   </w:p>
   <w:p>
     <w:pPr>
@@ -1804,7 +2019,6 @@
         <w:lang w:bidi="ar-IQ"/>
       </w:rPr>
     </w:pPr>
-    <w:r/>
   </w:p>
   <w:p>
     <w:pPr>
@@ -1814,13 +2028,11 @@
         <w:szCs w:val="12"/>
       </w:rPr>
     </w:pPr>
-    <w:r/>
   </w:p>
   <w:p>
     <w:pPr>
       <w:pStyle w:val="Header"/>
     </w:pPr>
-    <w:r/>
   </w:p>
   <w:p>
     <w:pPr>
@@ -1829,13 +2041,11 @@
         <w:lang w:bidi="ar-IQ"/>
       </w:rPr>
     </w:pPr>
-    <w:r/>
   </w:p>
   <w:p>
     <w:pPr>
       <w:pStyle w:val="Header"/>
     </w:pPr>
-    <w:r/>
   </w:p>
 </w:hdr>
 </file>
@@ -1850,7 +2060,7 @@
       <w:rPr>
         <w:noProof/>
       </w:rPr>
-      <w:pict w14:anchorId="64B1F0F6">
+      <w:pict w14:anchorId="53E7FB1D">
         <v:shapetype id="_x0000_t75" coordsize="21600,21600" o:spt="75" o:preferrelative="t" path="m@4@5l@4@11@9@11@9@5xe" filled="f" stroked="f">
           <v:stroke joinstyle="miter"/>
           <v:formulas>
@@ -5194,6 +5404,7 @@
   <w:style w:type="character" w:default="1" w:styleId="DefaultParagraphFont">
     <w:name w:val="Default Paragraph Font"/>
     <w:uiPriority w:val="1"/>
+    <w:semiHidden/>
     <w:unhideWhenUsed/>
   </w:style>
   <w:style w:type="table" w:default="1" w:styleId="TableNormal">

</xml_diff>